<commit_message>
Update module 1 assignment screenshots
</commit_message>
<xml_diff>
--- a/module-1/CSD402_GitHub_RepositorySetup.docx
+++ b/module-1/CSD402_GitHub_RepositorySetup.docx
@@ -7,12 +7,14 @@
         <w:spacing w:line="480" w:lineRule="auto"/>
         <w:jc w:val="center"/>
         <w:rPr>
+          <w:rFonts w:cs="Arial"/>
           <w:sz w:val="24"/>
           <w:szCs w:val="24"/>
         </w:rPr>
       </w:pPr>
       <w:r>
         <w:rPr>
+          <w:rFonts w:cs="Arial"/>
           <w:b/>
           <w:sz w:val="24"/>
           <w:szCs w:val="24"/>
@@ -25,12 +27,14 @@
         <w:spacing w:line="480" w:lineRule="auto"/>
         <w:jc w:val="center"/>
         <w:rPr>
+          <w:rFonts w:cs="Arial"/>
           <w:sz w:val="24"/>
           <w:szCs w:val="24"/>
         </w:rPr>
       </w:pPr>
       <w:r>
         <w:rPr>
+          <w:rFonts w:cs="Arial"/>
           <w:b/>
           <w:sz w:val="24"/>
           <w:szCs w:val="24"/>
@@ -43,12 +47,14 @@
         <w:spacing w:line="480" w:lineRule="auto"/>
         <w:jc w:val="center"/>
         <w:rPr>
+          <w:rFonts w:cs="Arial"/>
           <w:sz w:val="24"/>
           <w:szCs w:val="24"/>
         </w:rPr>
       </w:pPr>
       <w:r>
         <w:rPr>
+          <w:rFonts w:cs="Arial"/>
           <w:sz w:val="24"/>
           <w:szCs w:val="24"/>
         </w:rPr>
@@ -59,6 +65,7 @@
       <w:pPr>
         <w:spacing w:line="480" w:lineRule="auto"/>
         <w:rPr>
+          <w:rFonts w:cs="Arial"/>
           <w:sz w:val="24"/>
           <w:szCs w:val="24"/>
         </w:rPr>
@@ -72,8 +79,8 @@
         <w:tblLook w:val="04A0" w:firstRow="1" w:lastRow="0" w:firstColumn="1" w:lastColumn="0" w:noHBand="0" w:noVBand="1"/>
       </w:tblPr>
       <w:tblGrid>
-        <w:gridCol w:w="5040"/>
-        <w:gridCol w:w="5040"/>
+        <w:gridCol w:w="5032"/>
+        <w:gridCol w:w="5038"/>
       </w:tblGrid>
       <w:tr>
         <w:trPr>
@@ -88,12 +95,14 @@
             <w:pPr>
               <w:spacing w:line="480" w:lineRule="auto"/>
               <w:rPr>
+                <w:rFonts w:cs="Arial"/>
                 <w:sz w:val="24"/>
                 <w:szCs w:val="24"/>
               </w:rPr>
             </w:pPr>
             <w:r>
               <w:rPr>
+                <w:rFonts w:cs="Arial"/>
                 <w:b/>
                 <w:sz w:val="24"/>
                 <w:szCs w:val="24"/>
@@ -111,12 +120,14 @@
             <w:pPr>
               <w:spacing w:line="480" w:lineRule="auto"/>
               <w:rPr>
+                <w:rFonts w:cs="Arial"/>
                 <w:sz w:val="24"/>
                 <w:szCs w:val="24"/>
               </w:rPr>
             </w:pPr>
             <w:r>
               <w:rPr>
+                <w:rFonts w:cs="Arial"/>
                 <w:sz w:val="24"/>
                 <w:szCs w:val="24"/>
               </w:rPr>
@@ -138,12 +149,14 @@
             <w:pPr>
               <w:spacing w:line="480" w:lineRule="auto"/>
               <w:rPr>
+                <w:rFonts w:cs="Arial"/>
                 <w:sz w:val="24"/>
                 <w:szCs w:val="24"/>
               </w:rPr>
             </w:pPr>
             <w:r>
               <w:rPr>
+                <w:rFonts w:cs="Arial"/>
                 <w:b/>
                 <w:sz w:val="24"/>
                 <w:szCs w:val="24"/>
@@ -161,12 +174,14 @@
             <w:pPr>
               <w:spacing w:line="480" w:lineRule="auto"/>
               <w:rPr>
+                <w:rFonts w:cs="Arial"/>
                 <w:sz w:val="24"/>
                 <w:szCs w:val="24"/>
               </w:rPr>
             </w:pPr>
             <w:r>
               <w:rPr>
+                <w:rFonts w:cs="Arial"/>
                 <w:sz w:val="24"/>
                 <w:szCs w:val="24"/>
               </w:rPr>
@@ -188,12 +203,14 @@
             <w:pPr>
               <w:spacing w:line="480" w:lineRule="auto"/>
               <w:rPr>
+                <w:rFonts w:cs="Arial"/>
                 <w:sz w:val="24"/>
                 <w:szCs w:val="24"/>
               </w:rPr>
             </w:pPr>
             <w:r>
               <w:rPr>
+                <w:rFonts w:cs="Arial"/>
                 <w:b/>
                 <w:sz w:val="24"/>
                 <w:szCs w:val="24"/>
@@ -211,12 +228,14 @@
             <w:pPr>
               <w:spacing w:line="480" w:lineRule="auto"/>
               <w:rPr>
+                <w:rFonts w:cs="Arial"/>
                 <w:sz w:val="24"/>
                 <w:szCs w:val="24"/>
               </w:rPr>
             </w:pPr>
             <w:r>
               <w:rPr>
+                <w:rFonts w:cs="Arial"/>
                 <w:sz w:val="24"/>
                 <w:szCs w:val="24"/>
               </w:rPr>
@@ -238,12 +257,14 @@
             <w:pPr>
               <w:spacing w:line="480" w:lineRule="auto"/>
               <w:rPr>
+                <w:rFonts w:cs="Arial"/>
                 <w:sz w:val="24"/>
                 <w:szCs w:val="24"/>
               </w:rPr>
             </w:pPr>
             <w:r>
               <w:rPr>
+                <w:rFonts w:cs="Arial"/>
                 <w:b/>
                 <w:sz w:val="24"/>
                 <w:szCs w:val="24"/>
@@ -261,12 +282,14 @@
             <w:pPr>
               <w:spacing w:line="480" w:lineRule="auto"/>
               <w:rPr>
+                <w:rFonts w:cs="Arial"/>
                 <w:sz w:val="24"/>
                 <w:szCs w:val="24"/>
               </w:rPr>
             </w:pPr>
             <w:r>
               <w:rPr>
+                <w:rFonts w:cs="Arial"/>
                 <w:sz w:val="24"/>
                 <w:szCs w:val="24"/>
               </w:rPr>
@@ -280,6 +303,7 @@
       <w:pPr>
         <w:spacing w:line="480" w:lineRule="auto"/>
         <w:rPr>
+          <w:rFonts w:cs="Arial"/>
           <w:sz w:val="24"/>
           <w:szCs w:val="24"/>
         </w:rPr>
@@ -289,12 +313,14 @@
       <w:pPr>
         <w:spacing w:line="480" w:lineRule="auto"/>
         <w:rPr>
+          <w:rFonts w:cs="Arial"/>
           <w:sz w:val="24"/>
           <w:szCs w:val="24"/>
         </w:rPr>
       </w:pPr>
       <w:r>
         <w:rPr>
+          <w:rFonts w:cs="Arial"/>
           <w:b/>
           <w:sz w:val="24"/>
           <w:szCs w:val="24"/>
@@ -306,12 +332,14 @@
       <w:pPr>
         <w:spacing w:after="120" w:line="480" w:lineRule="auto"/>
         <w:rPr>
+          <w:rFonts w:cs="Arial"/>
           <w:sz w:val="24"/>
           <w:szCs w:val="24"/>
         </w:rPr>
       </w:pPr>
       <w:r>
         <w:rPr>
+          <w:rFonts w:cs="Arial"/>
           <w:sz w:val="24"/>
           <w:szCs w:val="24"/>
         </w:rPr>
@@ -320,6 +348,7 @@
       <w:proofErr w:type="gramStart"/>
       <w:r>
         <w:rPr>
+          <w:rFonts w:cs="Arial"/>
           <w:sz w:val="24"/>
           <w:szCs w:val="24"/>
         </w:rPr>
@@ -328,6 +357,7 @@
       <w:proofErr w:type="gramEnd"/>
       <w:r>
         <w:rPr>
+          <w:rFonts w:cs="Arial"/>
           <w:sz w:val="24"/>
           <w:szCs w:val="24"/>
         </w:rPr>
@@ -338,6 +368,7 @@
       <w:pPr>
         <w:spacing w:line="480" w:lineRule="auto"/>
         <w:rPr>
+          <w:rFonts w:cs="Arial"/>
           <w:b/>
           <w:sz w:val="24"/>
           <w:szCs w:val="24"/>
@@ -348,6 +379,7 @@
       <w:pPr>
         <w:spacing w:line="480" w:lineRule="auto"/>
         <w:rPr>
+          <w:rFonts w:cs="Arial"/>
           <w:b/>
           <w:sz w:val="24"/>
           <w:szCs w:val="24"/>
@@ -358,6 +390,7 @@
       <w:pPr>
         <w:spacing w:line="480" w:lineRule="auto"/>
         <w:rPr>
+          <w:rFonts w:cs="Arial"/>
           <w:b/>
           <w:sz w:val="24"/>
           <w:szCs w:val="24"/>
@@ -368,6 +401,7 @@
       <w:pPr>
         <w:spacing w:line="480" w:lineRule="auto"/>
         <w:rPr>
+          <w:rFonts w:cs="Arial"/>
           <w:b/>
           <w:sz w:val="24"/>
           <w:szCs w:val="24"/>
@@ -378,6 +412,7 @@
       <w:pPr>
         <w:spacing w:line="480" w:lineRule="auto"/>
         <w:rPr>
+          <w:rFonts w:cs="Arial"/>
           <w:b/>
           <w:sz w:val="24"/>
           <w:szCs w:val="24"/>
@@ -388,6 +423,7 @@
       <w:pPr>
         <w:spacing w:line="480" w:lineRule="auto"/>
         <w:rPr>
+          <w:rFonts w:cs="Arial"/>
           <w:b/>
           <w:sz w:val="24"/>
           <w:szCs w:val="24"/>
@@ -398,6 +434,7 @@
       <w:pPr>
         <w:spacing w:line="480" w:lineRule="auto"/>
         <w:rPr>
+          <w:rFonts w:cs="Arial"/>
           <w:b/>
           <w:sz w:val="24"/>
           <w:szCs w:val="24"/>
@@ -408,12 +445,14 @@
       <w:pPr>
         <w:spacing w:line="480" w:lineRule="auto"/>
         <w:rPr>
+          <w:rFonts w:cs="Arial"/>
           <w:sz w:val="24"/>
           <w:szCs w:val="24"/>
         </w:rPr>
       </w:pPr>
       <w:r>
         <w:rPr>
+          <w:rFonts w:cs="Arial"/>
           <w:b/>
           <w:sz w:val="24"/>
           <w:szCs w:val="24"/>
@@ -425,12 +464,14 @@
       <w:pPr>
         <w:spacing w:line="480" w:lineRule="auto"/>
         <w:rPr>
+          <w:rFonts w:cs="Arial"/>
           <w:sz w:val="24"/>
           <w:szCs w:val="24"/>
         </w:rPr>
       </w:pPr>
       <w:r>
         <w:rPr>
+          <w:rFonts w:cs="Arial"/>
           <w:sz w:val="24"/>
           <w:szCs w:val="24"/>
         </w:rPr>
@@ -439,6 +480,7 @@
       <w:proofErr w:type="gramStart"/>
       <w:r>
         <w:rPr>
+          <w:rFonts w:cs="Arial"/>
           <w:sz w:val="24"/>
           <w:szCs w:val="24"/>
         </w:rPr>
@@ -447,6 +489,7 @@
       <w:proofErr w:type="gramEnd"/>
       <w:r>
         <w:rPr>
+          <w:rFonts w:cs="Arial"/>
           <w:sz w:val="24"/>
           <w:szCs w:val="24"/>
         </w:rPr>
@@ -458,12 +501,14 @@
         <w:spacing w:line="480" w:lineRule="auto"/>
         <w:jc w:val="center"/>
         <w:rPr>
+          <w:rFonts w:cs="Arial"/>
           <w:sz w:val="24"/>
           <w:szCs w:val="24"/>
         </w:rPr>
       </w:pPr>
       <w:r>
         <w:rPr>
+          <w:rFonts w:cs="Arial"/>
           <w:noProof/>
           <w:sz w:val="24"/>
           <w:szCs w:val="24"/>
@@ -510,6 +555,7 @@
         <w:spacing w:line="480" w:lineRule="auto"/>
         <w:jc w:val="center"/>
         <w:rPr>
+          <w:rFonts w:cs="Arial"/>
           <w:iCs/>
           <w:sz w:val="24"/>
           <w:szCs w:val="24"/>
@@ -517,6 +563,7 @@
       </w:pPr>
       <w:r>
         <w:rPr>
+          <w:rFonts w:cs="Arial"/>
           <w:b/>
           <w:bCs/>
           <w:iCs/>
@@ -527,6 +574,7 @@
       </w:r>
       <w:r>
         <w:rPr>
+          <w:rFonts w:cs="Arial"/>
           <w:iCs/>
           <w:sz w:val="24"/>
           <w:szCs w:val="24"/>
@@ -538,12 +586,14 @@
       <w:pPr>
         <w:spacing w:line="480" w:lineRule="auto"/>
         <w:rPr>
+          <w:rFonts w:cs="Arial"/>
           <w:sz w:val="24"/>
           <w:szCs w:val="24"/>
         </w:rPr>
       </w:pPr>
       <w:r>
         <w:rPr>
+          <w:rFonts w:cs="Arial"/>
           <w:sz w:val="24"/>
           <w:szCs w:val="24"/>
         </w:rPr>
@@ -554,12 +604,14 @@
       <w:pPr>
         <w:spacing w:line="480" w:lineRule="auto"/>
         <w:rPr>
+          <w:rFonts w:cs="Arial"/>
           <w:sz w:val="24"/>
           <w:szCs w:val="24"/>
         </w:rPr>
       </w:pPr>
       <w:r>
         <w:rPr>
+          <w:rFonts w:cs="Arial"/>
           <w:b/>
           <w:sz w:val="24"/>
           <w:szCs w:val="24"/>
@@ -572,12 +624,14 @@
       <w:pPr>
         <w:spacing w:line="480" w:lineRule="auto"/>
         <w:rPr>
+          <w:rFonts w:cs="Arial"/>
           <w:sz w:val="24"/>
           <w:szCs w:val="24"/>
         </w:rPr>
       </w:pPr>
       <w:r>
         <w:rPr>
+          <w:rFonts w:cs="Arial"/>
           <w:sz w:val="24"/>
           <w:szCs w:val="24"/>
         </w:rPr>
@@ -586,6 +640,7 @@
       <w:proofErr w:type="gramStart"/>
       <w:r>
         <w:rPr>
+          <w:rFonts w:cs="Arial"/>
           <w:sz w:val="24"/>
           <w:szCs w:val="24"/>
         </w:rPr>
@@ -594,6 +649,7 @@
       <w:proofErr w:type="gramEnd"/>
       <w:r>
         <w:rPr>
+          <w:rFonts w:cs="Arial"/>
           <w:sz w:val="24"/>
           <w:szCs w:val="24"/>
         </w:rPr>
@@ -605,12 +661,14 @@
         <w:spacing w:line="480" w:lineRule="auto"/>
         <w:jc w:val="center"/>
         <w:rPr>
+          <w:rFonts w:cs="Arial"/>
           <w:sz w:val="24"/>
           <w:szCs w:val="24"/>
         </w:rPr>
       </w:pPr>
       <w:r>
         <w:rPr>
+          <w:rFonts w:cs="Arial"/>
           <w:noProof/>
           <w:sz w:val="24"/>
           <w:szCs w:val="24"/>
@@ -657,6 +715,7 @@
         <w:spacing w:line="480" w:lineRule="auto"/>
         <w:jc w:val="center"/>
         <w:rPr>
+          <w:rFonts w:cs="Arial"/>
           <w:b/>
           <w:bCs/>
           <w:iCs/>
@@ -666,6 +725,7 @@
       </w:pPr>
       <w:r>
         <w:rPr>
+          <w:rFonts w:cs="Arial"/>
           <w:b/>
           <w:bCs/>
           <w:iCs/>
@@ -679,6 +739,7 @@
       <w:pPr>
         <w:spacing w:before="160" w:line="480" w:lineRule="auto"/>
         <w:rPr>
+          <w:rFonts w:cs="Arial"/>
           <w:b/>
           <w:sz w:val="24"/>
           <w:szCs w:val="24"/>
@@ -689,6 +750,7 @@
       <w:pPr>
         <w:spacing w:before="160" w:line="480" w:lineRule="auto"/>
         <w:rPr>
+          <w:rFonts w:cs="Arial"/>
           <w:b/>
           <w:sz w:val="24"/>
           <w:szCs w:val="24"/>
@@ -699,6 +761,7 @@
       <w:pPr>
         <w:spacing w:before="160" w:line="480" w:lineRule="auto"/>
         <w:rPr>
+          <w:rFonts w:cs="Arial"/>
           <w:b/>
           <w:bCs/>
           <w:sz w:val="24"/>
@@ -707,6 +770,7 @@
       </w:pPr>
       <w:r>
         <w:rPr>
+          <w:rFonts w:cs="Arial"/>
           <w:b/>
           <w:sz w:val="24"/>
           <w:szCs w:val="24"/>
@@ -715,6 +779,7 @@
       </w:r>
       <w:r>
         <w:rPr>
+          <w:rFonts w:cs="Arial"/>
           <w:b/>
           <w:sz w:val="24"/>
           <w:szCs w:val="24"/>
@@ -723,6 +788,7 @@
       </w:r>
       <w:r>
         <w:rPr>
+          <w:rFonts w:cs="Arial"/>
           <w:sz w:val="24"/>
           <w:szCs w:val="24"/>
         </w:rPr>
@@ -730,6 +796,7 @@
       </w:r>
       <w:r>
         <w:rPr>
+          <w:rFonts w:cs="Arial"/>
           <w:b/>
           <w:bCs/>
           <w:sz w:val="24"/>
@@ -739,15 +806,577 @@
       </w:r>
       <w:r>
         <w:rPr>
+          <w:rFonts w:cs="Arial"/>
           <w:sz w:val="24"/>
           <w:szCs w:val="24"/>
         </w:rPr>
         <w:t xml:space="preserve"> https://github.com/FliporFlop1/csd-402</w:t>
       </w:r>
     </w:p>
+    <w:p>
+      <w:pPr>
+        <w:rPr>
+          <w:rFonts w:cs="Arial"/>
+          <w:b/>
+          <w:bCs/>
+          <w:sz w:val="24"/>
+          <w:szCs w:val="24"/>
+        </w:rPr>
+      </w:pPr>
+      <w:r>
+        <w:rPr>
+          <w:rFonts w:cs="Arial"/>
+          <w:sz w:val="24"/>
+          <w:szCs w:val="24"/>
+        </w:rPr>
+        <w:br w:type="page"/>
+      </w:r>
+      <w:r>
+        <w:rPr>
+          <w:rFonts w:cs="Arial"/>
+          <w:b/>
+          <w:bCs/>
+          <w:sz w:val="24"/>
+          <w:szCs w:val="24"/>
+        </w:rPr>
+        <w:lastRenderedPageBreak/>
+        <w:t>Module 1 Directory Creation</w:t>
+      </w:r>
+    </w:p>
+    <w:p>
+      <w:pPr>
+        <w:spacing w:after="160"/>
+        <w:rPr>
+          <w:rFonts w:cs="Arial"/>
+          <w:sz w:val="24"/>
+          <w:szCs w:val="24"/>
+        </w:rPr>
+      </w:pPr>
+      <w:r>
+        <w:rPr>
+          <w:rFonts w:cs="Arial"/>
+          <w:sz w:val="24"/>
+          <w:szCs w:val="24"/>
+        </w:rPr>
+        <w:t xml:space="preserve">The screenshot below verifies that the required module-1 directory was created in C:\csd\csd-402. The directory listing shows module-1 alongside the </w:t>
+      </w:r>
+      <w:proofErr w:type="gramStart"/>
+      <w:r>
+        <w:rPr>
+          <w:rFonts w:cs="Arial"/>
+          <w:sz w:val="24"/>
+          <w:szCs w:val="24"/>
+        </w:rPr>
+        <w:t>existing .gitignore</w:t>
+      </w:r>
+      <w:proofErr w:type="gramEnd"/>
+      <w:r>
+        <w:rPr>
+          <w:rFonts w:cs="Arial"/>
+          <w:sz w:val="24"/>
+          <w:szCs w:val="24"/>
+        </w:rPr>
+        <w:t xml:space="preserve"> and README.md files.</w:t>
+      </w:r>
+    </w:p>
+    <w:p>
+      <w:pPr>
+        <w:jc w:val="center"/>
+        <w:rPr>
+          <w:rFonts w:cs="Arial"/>
+          <w:sz w:val="24"/>
+          <w:szCs w:val="24"/>
+        </w:rPr>
+      </w:pPr>
+      <w:r>
+        <w:rPr>
+          <w:rFonts w:cs="Arial"/>
+          <w:noProof/>
+          <w:sz w:val="24"/>
+          <w:szCs w:val="24"/>
+        </w:rPr>
+        <w:drawing>
+          <wp:inline distT="0" distB="0" distL="0" distR="0" wp14:anchorId="54F38F0D" wp14:editId="1EC3D5F8">
+            <wp:extent cx="5806440" cy="3151694"/>
+            <wp:effectExtent l="0" t="0" r="0" b="0"/>
+            <wp:docPr id="3" name="Picture 3"/>
+            <wp:cNvGraphicFramePr>
+              <a:graphicFrameLocks xmlns:a="http://schemas.openxmlformats.org/drawingml/2006/main" noChangeAspect="1"/>
+            </wp:cNvGraphicFramePr>
+            <a:graphic xmlns:a="http://schemas.openxmlformats.org/drawingml/2006/main">
+              <a:graphicData uri="http://schemas.openxmlformats.org/drawingml/2006/picture">
+                <pic:pic xmlns:pic="http://schemas.openxmlformats.org/drawingml/2006/picture">
+                  <pic:nvPicPr>
+                    <pic:cNvPr id="0" name="Screenshot 2026-09-13 125357.png"/>
+                    <pic:cNvPicPr/>
+                  </pic:nvPicPr>
+                  <pic:blipFill>
+                    <a:blip r:embed="rId10"/>
+                    <a:stretch>
+                      <a:fillRect/>
+                    </a:stretch>
+                  </pic:blipFill>
+                  <pic:spPr>
+                    <a:xfrm>
+                      <a:off x="0" y="0"/>
+                      <a:ext cx="5806440" cy="3151694"/>
+                    </a:xfrm>
+                    <a:prstGeom prst="rect">
+                      <a:avLst/>
+                    </a:prstGeom>
+                  </pic:spPr>
+                </pic:pic>
+              </a:graphicData>
+            </a:graphic>
+          </wp:inline>
+        </w:drawing>
+      </w:r>
+    </w:p>
+    <w:p>
+      <w:pPr>
+        <w:jc w:val="center"/>
+        <w:rPr>
+          <w:rFonts w:cs="Arial"/>
+          <w:sz w:val="24"/>
+          <w:szCs w:val="24"/>
+        </w:rPr>
+      </w:pPr>
+      <w:r>
+        <w:rPr>
+          <w:rFonts w:cs="Arial"/>
+          <w:b/>
+          <w:i/>
+          <w:sz w:val="24"/>
+          <w:szCs w:val="24"/>
+        </w:rPr>
+        <w:t>Figure 3. Creation and verification of the module-1 directory.</w:t>
+      </w:r>
+    </w:p>
+    <w:p>
+      <w:pPr>
+        <w:rPr>
+          <w:rFonts w:cs="Arial"/>
+          <w:b/>
+          <w:bCs/>
+          <w:sz w:val="24"/>
+          <w:szCs w:val="24"/>
+        </w:rPr>
+      </w:pPr>
+      <w:r>
+        <w:rPr>
+          <w:rFonts w:cs="Arial"/>
+          <w:sz w:val="24"/>
+          <w:szCs w:val="24"/>
+        </w:rPr>
+        <w:br w:type="page"/>
+      </w:r>
+      <w:r>
+        <w:rPr>
+          <w:rFonts w:cs="Arial"/>
+          <w:b/>
+          <w:bCs/>
+          <w:sz w:val="24"/>
+          <w:szCs w:val="24"/>
+        </w:rPr>
+        <w:lastRenderedPageBreak/>
+        <w:t>Git Stage Verification</w:t>
+      </w:r>
+    </w:p>
+    <w:p>
+      <w:pPr>
+        <w:spacing w:after="160"/>
+        <w:rPr>
+          <w:rFonts w:cs="Arial"/>
+          <w:sz w:val="24"/>
+          <w:szCs w:val="24"/>
+        </w:rPr>
+      </w:pPr>
+      <w:r>
+        <w:rPr>
+          <w:rFonts w:cs="Arial"/>
+          <w:sz w:val="24"/>
+          <w:szCs w:val="24"/>
+        </w:rPr>
+        <w:t>After the Word document was placed in module-1, git add --all was used to stage the changes. The git status output below confirms that the assignment document was staged and ready to be committed.</w:t>
+      </w:r>
+    </w:p>
+    <w:p>
+      <w:pPr>
+        <w:jc w:val="center"/>
+        <w:rPr>
+          <w:rFonts w:cs="Arial"/>
+          <w:sz w:val="24"/>
+          <w:szCs w:val="24"/>
+        </w:rPr>
+      </w:pPr>
+      <w:r>
+        <w:rPr>
+          <w:rFonts w:cs="Arial"/>
+          <w:noProof/>
+          <w:sz w:val="24"/>
+          <w:szCs w:val="24"/>
+        </w:rPr>
+        <w:drawing>
+          <wp:inline distT="0" distB="0" distL="0" distR="0" wp14:anchorId="59F44251" wp14:editId="0AA0F240">
+            <wp:extent cx="5806440" cy="1631208"/>
+            <wp:effectExtent l="0" t="0" r="0" b="0"/>
+            <wp:docPr id="4" name="Picture 4"/>
+            <wp:cNvGraphicFramePr>
+              <a:graphicFrameLocks xmlns:a="http://schemas.openxmlformats.org/drawingml/2006/main" noChangeAspect="1"/>
+            </wp:cNvGraphicFramePr>
+            <a:graphic xmlns:a="http://schemas.openxmlformats.org/drawingml/2006/main">
+              <a:graphicData uri="http://schemas.openxmlformats.org/drawingml/2006/picture">
+                <pic:pic xmlns:pic="http://schemas.openxmlformats.org/drawingml/2006/picture">
+                  <pic:nvPicPr>
+                    <pic:cNvPr id="0" name="Screenshot 2026-09-13 131508.png"/>
+                    <pic:cNvPicPr/>
+                  </pic:nvPicPr>
+                  <pic:blipFill>
+                    <a:blip r:embed="rId11"/>
+                    <a:stretch>
+                      <a:fillRect/>
+                    </a:stretch>
+                  </pic:blipFill>
+                  <pic:spPr>
+                    <a:xfrm>
+                      <a:off x="0" y="0"/>
+                      <a:ext cx="5806440" cy="1631208"/>
+                    </a:xfrm>
+                    <a:prstGeom prst="rect">
+                      <a:avLst/>
+                    </a:prstGeom>
+                  </pic:spPr>
+                </pic:pic>
+              </a:graphicData>
+            </a:graphic>
+          </wp:inline>
+        </w:drawing>
+      </w:r>
+    </w:p>
+    <w:p>
+      <w:pPr>
+        <w:jc w:val="center"/>
+        <w:rPr>
+          <w:rFonts w:cs="Arial"/>
+          <w:sz w:val="24"/>
+          <w:szCs w:val="24"/>
+        </w:rPr>
+      </w:pPr>
+      <w:r>
+        <w:rPr>
+          <w:rFonts w:cs="Arial"/>
+          <w:b/>
+          <w:i/>
+          <w:sz w:val="24"/>
+          <w:szCs w:val="24"/>
+        </w:rPr>
+        <w:t>Figure 4. Git status showing the Module 1 Word document staged for commit.</w:t>
+      </w:r>
+    </w:p>
+    <w:p>
+      <w:pPr>
+        <w:rPr>
+          <w:rFonts w:cs="Arial"/>
+          <w:b/>
+          <w:bCs/>
+          <w:sz w:val="24"/>
+          <w:szCs w:val="24"/>
+        </w:rPr>
+      </w:pPr>
+    </w:p>
+    <w:p>
+      <w:pPr>
+        <w:rPr>
+          <w:rFonts w:cs="Arial"/>
+          <w:b/>
+          <w:bCs/>
+          <w:sz w:val="24"/>
+          <w:szCs w:val="24"/>
+        </w:rPr>
+      </w:pPr>
+    </w:p>
+    <w:p>
+      <w:pPr>
+        <w:rPr>
+          <w:rFonts w:cs="Arial"/>
+          <w:b/>
+          <w:bCs/>
+          <w:sz w:val="24"/>
+          <w:szCs w:val="24"/>
+        </w:rPr>
+      </w:pPr>
+    </w:p>
+    <w:p>
+      <w:pPr>
+        <w:rPr>
+          <w:rFonts w:cs="Arial"/>
+          <w:b/>
+          <w:bCs/>
+          <w:sz w:val="24"/>
+          <w:szCs w:val="24"/>
+        </w:rPr>
+      </w:pPr>
+    </w:p>
+    <w:p>
+      <w:pPr>
+        <w:rPr>
+          <w:rFonts w:cs="Arial"/>
+          <w:b/>
+          <w:bCs/>
+          <w:sz w:val="24"/>
+          <w:szCs w:val="24"/>
+        </w:rPr>
+      </w:pPr>
+      <w:r>
+        <w:rPr>
+          <w:rFonts w:cs="Arial"/>
+          <w:b/>
+          <w:bCs/>
+          <w:sz w:val="24"/>
+          <w:szCs w:val="24"/>
+        </w:rPr>
+        <w:t>Git Commit Verification</w:t>
+      </w:r>
+    </w:p>
+    <w:p>
+      <w:pPr>
+        <w:spacing w:after="160"/>
+        <w:rPr>
+          <w:rFonts w:cs="Arial"/>
+          <w:sz w:val="24"/>
+          <w:szCs w:val="24"/>
+        </w:rPr>
+      </w:pPr>
+      <w:r>
+        <w:rPr>
+          <w:rFonts w:cs="Arial"/>
+          <w:sz w:val="24"/>
+          <w:szCs w:val="24"/>
+        </w:rPr>
+        <w:t>The staged assignment document was committed to the local repository with the message "Add module 1 assignment." The output confirms that the new Word document was successfully included in the commit.</w:t>
+      </w:r>
+    </w:p>
+    <w:p>
+      <w:pPr>
+        <w:jc w:val="center"/>
+        <w:rPr>
+          <w:rFonts w:cs="Arial"/>
+          <w:sz w:val="24"/>
+          <w:szCs w:val="24"/>
+        </w:rPr>
+      </w:pPr>
+      <w:r>
+        <w:rPr>
+          <w:rFonts w:cs="Arial"/>
+          <w:noProof/>
+          <w:sz w:val="24"/>
+          <w:szCs w:val="24"/>
+        </w:rPr>
+        <w:drawing>
+          <wp:inline distT="0" distB="0" distL="0" distR="0" wp14:anchorId="5B7A260A" wp14:editId="78122E96">
+            <wp:extent cx="5806440" cy="1115863"/>
+            <wp:effectExtent l="0" t="0" r="0" b="0"/>
+            <wp:docPr id="5" name="Picture 5"/>
+            <wp:cNvGraphicFramePr>
+              <a:graphicFrameLocks xmlns:a="http://schemas.openxmlformats.org/drawingml/2006/main" noChangeAspect="1"/>
+            </wp:cNvGraphicFramePr>
+            <a:graphic xmlns:a="http://schemas.openxmlformats.org/drawingml/2006/main">
+              <a:graphicData uri="http://schemas.openxmlformats.org/drawingml/2006/picture">
+                <pic:pic xmlns:pic="http://schemas.openxmlformats.org/drawingml/2006/picture">
+                  <pic:nvPicPr>
+                    <pic:cNvPr id="0" name="Screenshot 2026-09-13 131545.png"/>
+                    <pic:cNvPicPr/>
+                  </pic:nvPicPr>
+                  <pic:blipFill>
+                    <a:blip r:embed="rId12"/>
+                    <a:stretch>
+                      <a:fillRect/>
+                    </a:stretch>
+                  </pic:blipFill>
+                  <pic:spPr>
+                    <a:xfrm>
+                      <a:off x="0" y="0"/>
+                      <a:ext cx="5806440" cy="1115863"/>
+                    </a:xfrm>
+                    <a:prstGeom prst="rect">
+                      <a:avLst/>
+                    </a:prstGeom>
+                  </pic:spPr>
+                </pic:pic>
+              </a:graphicData>
+            </a:graphic>
+          </wp:inline>
+        </w:drawing>
+      </w:r>
+    </w:p>
+    <w:p>
+      <w:pPr>
+        <w:jc w:val="center"/>
+        <w:rPr>
+          <w:rFonts w:cs="Arial"/>
+          <w:sz w:val="24"/>
+          <w:szCs w:val="24"/>
+        </w:rPr>
+      </w:pPr>
+      <w:r>
+        <w:rPr>
+          <w:rFonts w:cs="Arial"/>
+          <w:b/>
+          <w:i/>
+          <w:sz w:val="24"/>
+          <w:szCs w:val="24"/>
+        </w:rPr>
+        <w:t xml:space="preserve">Figure 5. Successful Git </w:t>
+      </w:r>
+      <w:proofErr w:type="gramStart"/>
+      <w:r>
+        <w:rPr>
+          <w:rFonts w:cs="Arial"/>
+          <w:b/>
+          <w:i/>
+          <w:sz w:val="24"/>
+          <w:szCs w:val="24"/>
+        </w:rPr>
+        <w:t>commit</w:t>
+      </w:r>
+      <w:proofErr w:type="gramEnd"/>
+      <w:r>
+        <w:rPr>
+          <w:rFonts w:cs="Arial"/>
+          <w:b/>
+          <w:i/>
+          <w:sz w:val="24"/>
+          <w:szCs w:val="24"/>
+        </w:rPr>
+        <w:t xml:space="preserve"> of the Module 1 assignment document.</w:t>
+      </w:r>
+    </w:p>
+    <w:p>
+      <w:pPr>
+        <w:rPr>
+          <w:rFonts w:cs="Arial"/>
+          <w:b/>
+          <w:bCs/>
+          <w:sz w:val="24"/>
+          <w:szCs w:val="24"/>
+        </w:rPr>
+      </w:pPr>
+      <w:r>
+        <w:rPr>
+          <w:rFonts w:cs="Arial"/>
+          <w:sz w:val="24"/>
+          <w:szCs w:val="24"/>
+        </w:rPr>
+        <w:br w:type="page"/>
+      </w:r>
+      <w:r>
+        <w:rPr>
+          <w:rFonts w:cs="Arial"/>
+          <w:b/>
+          <w:bCs/>
+          <w:sz w:val="24"/>
+          <w:szCs w:val="24"/>
+        </w:rPr>
+        <w:lastRenderedPageBreak/>
+        <w:t>GitHub Push Verification</w:t>
+      </w:r>
+    </w:p>
+    <w:p>
+      <w:pPr>
+        <w:spacing w:after="160"/>
+        <w:rPr>
+          <w:rFonts w:cs="Arial"/>
+          <w:sz w:val="24"/>
+          <w:szCs w:val="24"/>
+        </w:rPr>
+      </w:pPr>
+      <w:r>
+        <w:rPr>
+          <w:rFonts w:cs="Arial"/>
+          <w:sz w:val="24"/>
+          <w:szCs w:val="24"/>
+        </w:rPr>
+        <w:t>After the commit was pushed to GitHub, the assignment document appeared in the remote repository under module-1. The screenshot below shows the repository path csd-402 / module-1 / CSD402_GitHub_RepositorySetup.docx.</w:t>
+      </w:r>
+    </w:p>
+    <w:p>
+      <w:pPr>
+        <w:jc w:val="center"/>
+        <w:rPr>
+          <w:rFonts w:cs="Arial"/>
+          <w:sz w:val="24"/>
+          <w:szCs w:val="24"/>
+        </w:rPr>
+      </w:pPr>
+      <w:r>
+        <w:rPr>
+          <w:rFonts w:cs="Arial"/>
+          <w:noProof/>
+          <w:sz w:val="24"/>
+          <w:szCs w:val="24"/>
+        </w:rPr>
+        <w:drawing>
+          <wp:inline distT="0" distB="0" distL="0" distR="0" wp14:anchorId="6C923257" wp14:editId="3FA22B91">
+            <wp:extent cx="5806440" cy="2935840"/>
+            <wp:effectExtent l="0" t="0" r="0" b="0"/>
+            <wp:docPr id="6" name="Picture 6"/>
+            <wp:cNvGraphicFramePr>
+              <a:graphicFrameLocks xmlns:a="http://schemas.openxmlformats.org/drawingml/2006/main" noChangeAspect="1"/>
+            </wp:cNvGraphicFramePr>
+            <a:graphic xmlns:a="http://schemas.openxmlformats.org/drawingml/2006/main">
+              <a:graphicData uri="http://schemas.openxmlformats.org/drawingml/2006/picture">
+                <pic:pic xmlns:pic="http://schemas.openxmlformats.org/drawingml/2006/picture">
+                  <pic:nvPicPr>
+                    <pic:cNvPr id="0" name="Screenshot 2026-09-13 132252.png"/>
+                    <pic:cNvPicPr/>
+                  </pic:nvPicPr>
+                  <pic:blipFill>
+                    <a:blip r:embed="rId13"/>
+                    <a:stretch>
+                      <a:fillRect/>
+                    </a:stretch>
+                  </pic:blipFill>
+                  <pic:spPr>
+                    <a:xfrm>
+                      <a:off x="0" y="0"/>
+                      <a:ext cx="5806440" cy="2935840"/>
+                    </a:xfrm>
+                    <a:prstGeom prst="rect">
+                      <a:avLst/>
+                    </a:prstGeom>
+                  </pic:spPr>
+                </pic:pic>
+              </a:graphicData>
+            </a:graphic>
+          </wp:inline>
+        </w:drawing>
+      </w:r>
+    </w:p>
+    <w:p>
+      <w:pPr>
+        <w:jc w:val="center"/>
+        <w:rPr>
+          <w:rFonts w:cs="Arial"/>
+          <w:b/>
+          <w:iCs/>
+          <w:sz w:val="24"/>
+          <w:szCs w:val="24"/>
+        </w:rPr>
+      </w:pPr>
+      <w:r>
+        <w:rPr>
+          <w:rFonts w:cs="Arial"/>
+          <w:b/>
+          <w:iCs/>
+          <w:sz w:val="24"/>
+          <w:szCs w:val="24"/>
+        </w:rPr>
+        <w:t>Figure 6. Assignment document successfully uploaded to the module-1 directory on GitHub.</w:t>
+      </w:r>
+    </w:p>
     <w:sectPr>
-      <w:headerReference w:type="default" r:id="rId10"/>
-      <w:footerReference w:type="default" r:id="rId11"/>
+      <w:headerReference w:type="default" r:id="rId14"/>
+      <w:footerReference w:type="default" r:id="rId15"/>
       <w:pgSz w:w="12240" w:h="15840"/>
       <w:pgMar w:top="936" w:right="1080" w:bottom="936" w:left="1080" w:header="720" w:footer="720" w:gutter="0"/>
       <w:cols w:space="720"/>
@@ -1750,6 +2379,7 @@
   <w:style w:type="character" w:default="1" w:styleId="DefaultParagraphFont">
     <w:name w:val="Default Paragraph Font"/>
     <w:uiPriority w:val="1"/>
+    <w:semiHidden/>
     <w:unhideWhenUsed/>
   </w:style>
   <w:style w:type="table" w:default="1" w:styleId="TableNormal">

</xml_diff>